<commit_message>
Friday: Add WorkSafeNB JHSC & Life Start CPR/AED Level C certifications to Rayne's resume suite
</commit_message>
<xml_diff>
--- a/Rayne_Moulton_Resume.docx
+++ b/Rayne_Moulton_Resume.docx
@@ -4,7 +4,7 @@
   <w:body>
     <w:p>
       <w:pPr>
-        <w:spacing w:after="240"/>
+        <w:spacing w:before="0" w:after="20" w:line="276" w:lineRule="auto"/>
         <w:jc w:val="center"/>
       </w:pPr>
       <w:r>
@@ -12,23 +12,29 @@
           <w:rFonts w:ascii="Arial" w:hAnsi="Arial"/>
           <w:b/>
           <w:color w:val="1B4D3E"/>
-          <w:sz w:val="44"/>
+          <w:sz w:val="36"/>
         </w:rPr>
         <w:t>RAYNE MOULTON</w:t>
-        <w:br/>
-      </w:r>
-      <w:r>
-        <w:rPr>
-          <w:rFonts w:ascii="Arial" w:hAnsi="Arial"/>
-          <w:color w:val="464646"/>
-          <w:sz w:val="20"/>
-        </w:rPr>
-        <w:t>Quispamsis, NB  •  (403) 618-3006  •  rayne.moulton1234@gmail.com</w:t>
       </w:r>
     </w:p>
     <w:p>
       <w:pPr>
-        <w:spacing w:before="200" w:after="80"/>
+        <w:spacing w:before="0" w:after="160" w:line="276" w:lineRule="auto"/>
+        <w:jc w:val="center"/>
+      </w:pPr>
+      <w:r>
+        <w:rPr>
+          <w:rFonts w:ascii="Arial" w:hAnsi="Arial"/>
+          <w:color w:val="555555"/>
+          <w:sz w:val="19"/>
+        </w:rPr>
+        <w:t>Quispamsis, NB   •   (403) 618-3006   •   rayne.moulton1234@gmail.com</w:t>
+      </w:r>
+    </w:p>
+    <w:p>
+      <w:pPr>
+        <w:keepNext/>
+        <w:spacing w:before="160" w:after="60"/>
         <w:pBdr>
           <w:bottom w:val="single" w:sz="8" w:space="2" w:color="1B4D3E"/>
         </w:pBdr>
@@ -38,27 +44,27 @@
           <w:rFonts w:ascii="Arial" w:hAnsi="Arial"/>
           <w:b/>
           <w:color w:val="1B4D3E"/>
-          <w:sz w:val="22"/>
+          <w:sz w:val="21"/>
         </w:rPr>
         <w:t>PROFESSIONAL SUMMARY</w:t>
       </w:r>
     </w:p>
     <w:p>
       <w:pPr>
-        <w:spacing w:after="120" w:line="276" w:lineRule="auto"/>
+        <w:spacing w:before="0" w:after="120" w:line="276" w:lineRule="auto"/>
       </w:pPr>
       <w:r>
         <w:rPr>
           <w:rFonts w:ascii="Arial" w:hAnsi="Arial"/>
-          <w:color w:val="282828"/>
-          <w:sz w:val="20"/>
+          <w:sz w:val="19"/>
         </w:rPr>
-        <w:t>Motivated and dependable NBCC Practical Nursing student with strong communication skills and a proven ability to thrive in fast-paced customer service and retail environments. Seeking part-time or casual employment.</w:t>
+        <w:t>Motivated, dependable customer service and retail professional with over two years of hands-on experience in fast-paced retail and hospitality environments. WorkSafeNB JHSC safety trained and certified in CPR/AED Level C. Strong communicator known for reliability, accurate cash handling, team collaboration, and completely flexible availability.</w:t>
       </w:r>
     </w:p>
     <w:p>
       <w:pPr>
-        <w:spacing w:before="200" w:after="80"/>
+        <w:keepNext/>
+        <w:spacing w:before="160" w:after="60"/>
         <w:pBdr>
           <w:bottom w:val="single" w:sz="8" w:space="2" w:color="1B4D3E"/>
         </w:pBdr>
@@ -68,7 +74,7 @@
           <w:rFonts w:ascii="Arial" w:hAnsi="Arial"/>
           <w:b/>
           <w:color w:val="1B4D3E"/>
-          <w:sz w:val="22"/>
+          <w:sz w:val="21"/>
         </w:rPr>
         <w:t>CORE COMPETENCIES</w:t>
       </w:r>
@@ -76,62 +82,59 @@
     <w:p>
       <w:pPr>
         <w:pStyle w:val="ListBullet"/>
-        <w:spacing w:before="0" w:after="40"/>
+        <w:spacing w:before="0" w:after="30"/>
       </w:pPr>
       <w:r>
         <w:rPr>
           <w:rFonts w:ascii="Arial" w:hAnsi="Arial"/>
-          <w:color w:val="282828"/>
-          <w:sz w:val="19"/>
+          <w:sz w:val="18"/>
         </w:rPr>
-        <w:t>Customer Service &amp; Client Relations  |  POS Systems &amp; Cash Handling</w:t>
+        <w:t>Customer Service &amp; Client Care  |  POS Systems &amp; Cash Handling</w:t>
       </w:r>
     </w:p>
     <w:p>
       <w:pPr>
         <w:pStyle w:val="ListBullet"/>
-        <w:spacing w:before="0" w:after="40"/>
+        <w:spacing w:before="0" w:after="30"/>
       </w:pPr>
       <w:r>
         <w:rPr>
           <w:rFonts w:ascii="Arial" w:hAnsi="Arial"/>
-          <w:color w:val="282828"/>
-          <w:sz w:val="19"/>
+          <w:sz w:val="18"/>
         </w:rPr>
-        <w:t>Time Management &amp; Organization  |  Operational Support &amp; Efficiency</w:t>
+        <w:t>Workplace Health &amp; Safety (WorkSafeNB JHSC Certified)  |  CPR/AED Level C Certified</w:t>
       </w:r>
     </w:p>
     <w:p>
       <w:pPr>
         <w:pStyle w:val="ListBullet"/>
-        <w:spacing w:before="0" w:after="40"/>
+        <w:spacing w:before="0" w:after="30"/>
       </w:pPr>
       <w:r>
         <w:rPr>
           <w:rFonts w:ascii="Arial" w:hAnsi="Arial"/>
-          <w:color w:val="282828"/>
-          <w:sz w:val="19"/>
+          <w:sz w:val="18"/>
         </w:rPr>
-        <w:t>Team Collaboration  |  Attention to Detail &amp; Accuracy</w:t>
+        <w:t>Visual Merchandising &amp; Floor Resets  |  Inventory &amp; Freight Intake</w:t>
       </w:r>
     </w:p>
     <w:p>
       <w:pPr>
         <w:pStyle w:val="ListBullet"/>
-        <w:spacing w:before="0" w:after="40"/>
+        <w:spacing w:before="0" w:after="30"/>
       </w:pPr>
       <w:r>
         <w:rPr>
           <w:rFonts w:ascii="Arial" w:hAnsi="Arial"/>
-          <w:color w:val="282828"/>
-          <w:sz w:val="19"/>
+          <w:sz w:val="18"/>
         </w:rPr>
-        <w:t>Adaptability &amp; Flexibility</w:t>
+        <w:t>Team Collaboration &amp; High Punctuality  |  Completely Open Availability</w:t>
       </w:r>
     </w:p>
     <w:p>
       <w:pPr>
-        <w:spacing w:before="200" w:after="80"/>
+        <w:keepNext/>
+        <w:spacing w:before="160" w:after="60"/>
         <w:pBdr>
           <w:bottom w:val="single" w:sz="8" w:space="2" w:color="1B4D3E"/>
         </w:pBdr>
@@ -141,290 +144,237 @@
           <w:rFonts w:ascii="Arial" w:hAnsi="Arial"/>
           <w:b/>
           <w:color w:val="1B4D3E"/>
-          <w:sz w:val="22"/>
+          <w:sz w:val="21"/>
         </w:rPr>
         <w:t>PROFESSIONAL EXPERIENCE</w:t>
       </w:r>
     </w:p>
     <w:p>
       <w:pPr>
-        <w:spacing w:before="120" w:after="40"/>
+        <w:spacing w:before="60" w:after="20" w:line="276" w:lineRule="auto"/>
       </w:pPr>
       <w:r>
         <w:rPr>
           <w:rFonts w:ascii="Arial" w:hAnsi="Arial"/>
           <w:b/>
-          <w:color w:val="282828"/>
-          <w:sz w:val="21"/>
+          <w:sz w:val="19"/>
         </w:rPr>
-        <w:t>Retail Sales Associate</w:t>
+        <w:t>Retail Sales Associate  |  La Vie En Rose</w:t>
       </w:r>
       <w:r>
         <w:rPr>
           <w:rFonts w:ascii="Arial" w:hAnsi="Arial"/>
           <w:i/>
-          <w:color w:val="464646"/>
-          <w:sz w:val="20"/>
+          <w:color w:val="1B4D3E"/>
+          <w:sz w:val="17"/>
         </w:rPr>
-        <w:t xml:space="preserve">  |  La Vie En Rose  —  Quispamsis / Saint John, NB</w:t>
-      </w:r>
-    </w:p>
-    <w:p>
-      <w:pPr>
-        <w:spacing w:after="80"/>
-      </w:pPr>
-      <w:r>
-        <w:rPr>
-          <w:b/>
-          <w:color w:val="1B4D3E"/>
-          <w:sz w:val="19"/>
-        </w:rPr>
-        <w:t>June 2026 – September 2026</w:t>
+        <w:t xml:space="preserve">   (June 2026 – September 2026 | Saint John, NB)</w:t>
       </w:r>
     </w:p>
     <w:p>
       <w:pPr>
         <w:pStyle w:val="ListBullet"/>
-        <w:spacing w:after="40" w:line="264" w:lineRule="auto"/>
+        <w:spacing w:before="0" w:after="30"/>
       </w:pPr>
       <w:r>
         <w:rPr>
           <w:rFonts w:ascii="Arial" w:hAnsi="Arial"/>
-          <w:color w:val="282828"/>
-          <w:sz w:val="19"/>
+          <w:sz w:val="18"/>
         </w:rPr>
-        <w:t>Provided personalized customer service, assisting clients with specialized product selection and fit to ensure comfort and satisfaction.</w:t>
+        <w:t>Provided personalized, attentive customer service, assisting clients with specialized product selection and fit to ensure comfort and satisfaction.</w:t>
       </w:r>
     </w:p>
     <w:p>
       <w:pPr>
         <w:pStyle w:val="ListBullet"/>
-        <w:spacing w:after="40" w:line="264" w:lineRule="auto"/>
+        <w:spacing w:before="0" w:after="30"/>
       </w:pPr>
       <w:r>
         <w:rPr>
           <w:rFonts w:ascii="Arial" w:hAnsi="Arial"/>
-          <w:color w:val="282828"/>
-          <w:sz w:val="19"/>
+          <w:sz w:val="18"/>
         </w:rPr>
-        <w:t>Maintained store presentation standards by organizing displays, replenishing inventory, and ensuring a welcoming shopping environment.</w:t>
+        <w:t>Maintained pristine store visual standards by organizing product displays, replenishing inventory, and ensuring an inviting shopping environment.</w:t>
       </w:r>
     </w:p>
     <w:p>
       <w:pPr>
         <w:pStyle w:val="ListBullet"/>
-        <w:spacing w:after="40" w:line="264" w:lineRule="auto"/>
+        <w:spacing w:before="0" w:after="30"/>
       </w:pPr>
       <w:r>
         <w:rPr>
           <w:rFonts w:ascii="Arial" w:hAnsi="Arial"/>
-          <w:color w:val="282828"/>
-          <w:sz w:val="19"/>
+          <w:sz w:val="18"/>
         </w:rPr>
-        <w:t>Processed transactions accurately and efficiently using the point-of-sale (POS) system while promoting store loyalty programs.</w:t>
+        <w:t>Processed customer transactions quickly and accurately on the POS terminal while actively promoting store loyalty rewards.</w:t>
       </w:r>
     </w:p>
     <w:p>
       <w:pPr>
         <w:pStyle w:val="ListBullet"/>
-        <w:spacing w:after="40" w:line="264" w:lineRule="auto"/>
+        <w:spacing w:before="0" w:after="30"/>
       </w:pPr>
       <w:r>
         <w:rPr>
           <w:rFonts w:ascii="Arial" w:hAnsi="Arial"/>
-          <w:color w:val="282828"/>
-          <w:sz w:val="19"/>
+          <w:sz w:val="18"/>
         </w:rPr>
-        <w:t>Contributed to daily operations through team collaboration, stockroom organization, and maintaining an efficient sales floor.</w:t>
+        <w:t>Contributed to daily operational flow through stockroom organization, incoming shipment intake, and active sales floor support.</w:t>
       </w:r>
     </w:p>
     <w:p>
       <w:pPr>
-        <w:spacing w:before="120" w:after="40"/>
+        <w:spacing w:before="60" w:after="20" w:line="276" w:lineRule="auto"/>
       </w:pPr>
       <w:r>
         <w:rPr>
           <w:rFonts w:ascii="Arial" w:hAnsi="Arial"/>
           <w:b/>
-          <w:color w:val="282828"/>
-          <w:sz w:val="21"/>
+          <w:sz w:val="19"/>
         </w:rPr>
-        <w:t>Retail Sales Associate</w:t>
+        <w:t>Retail Sales Associate  |  Sport Chek (Canadian Tire Corporation)</w:t>
       </w:r>
       <w:r>
         <w:rPr>
           <w:rFonts w:ascii="Arial" w:hAnsi="Arial"/>
           <w:i/>
-          <w:color w:val="464646"/>
-          <w:sz w:val="20"/>
+          <w:color w:val="1B4D3E"/>
+          <w:sz w:val="17"/>
         </w:rPr>
-        <w:t xml:space="preserve">  |  Sport Chek  —  Saint John, NB</w:t>
-      </w:r>
-    </w:p>
-    <w:p>
-      <w:pPr>
-        <w:spacing w:after="80"/>
-      </w:pPr>
-      <w:r>
-        <w:rPr>
-          <w:b/>
-          <w:color w:val="1B4D3E"/>
-          <w:sz w:val="19"/>
-        </w:rPr>
-        <w:t>November 2025 – August 2026</w:t>
+        <w:t xml:space="preserve">   (November 2025 – August 2026 | Saint John, NB)</w:t>
       </w:r>
     </w:p>
     <w:p>
       <w:pPr>
         <w:pStyle w:val="ListBullet"/>
-        <w:spacing w:after="40" w:line="264" w:lineRule="auto"/>
+        <w:spacing w:before="0" w:after="30"/>
       </w:pPr>
       <w:r>
         <w:rPr>
           <w:rFonts w:ascii="Arial" w:hAnsi="Arial"/>
-          <w:color w:val="282828"/>
-          <w:sz w:val="19"/>
+          <w:sz w:val="18"/>
         </w:rPr>
-        <w:t>Engaged with customers to understand their athletic and footwear needs, providing knowledgeable product recommendations.</w:t>
+        <w:t>Engaged with diverse customers to understand athletic, footwear, and apparel needs, providing knowledgeable recommendations.</w:t>
       </w:r>
     </w:p>
     <w:p>
       <w:pPr>
         <w:pStyle w:val="ListBullet"/>
-        <w:spacing w:after="40" w:line="264" w:lineRule="auto"/>
+        <w:spacing w:before="0" w:after="30"/>
       </w:pPr>
       <w:r>
         <w:rPr>
           <w:rFonts w:ascii="Arial" w:hAnsi="Arial"/>
-          <w:color w:val="282828"/>
-          <w:sz w:val="19"/>
+          <w:sz w:val="18"/>
         </w:rPr>
-        <w:t>Achieved a fast-paced and efficient sales environment by keeping high-traffic merchandise zones organized and fully stocked.</w:t>
+        <w:t>Maintained high-traffic retail merchandise zones organized, neat, and fully restocked during peak shopping hours.</w:t>
       </w:r>
     </w:p>
     <w:p>
       <w:pPr>
         <w:pStyle w:val="ListBullet"/>
-        <w:spacing w:after="40" w:line="264" w:lineRule="auto"/>
+        <w:spacing w:before="0" w:after="30"/>
       </w:pPr>
       <w:r>
         <w:rPr>
           <w:rFonts w:ascii="Arial" w:hAnsi="Arial"/>
-          <w:color w:val="282828"/>
-          <w:sz w:val="19"/>
+          <w:sz w:val="18"/>
         </w:rPr>
-        <w:t>Handled cash, debit, and credit transactions reliably, ensuring accurate till balances at the end of shifts.</w:t>
+        <w:t>Handled cash, debit, credit, and gift card transactions reliably, maintaining accurate till balances with zero discrepancies.</w:t>
       </w:r>
     </w:p>
     <w:p>
       <w:pPr>
         <w:pStyle w:val="ListBullet"/>
-        <w:spacing w:after="40" w:line="264" w:lineRule="auto"/>
+        <w:spacing w:before="0" w:after="30"/>
       </w:pPr>
       <w:r>
         <w:rPr>
           <w:rFonts w:ascii="Arial" w:hAnsi="Arial"/>
-          <w:color w:val="282828"/>
-          <w:sz w:val="19"/>
+          <w:sz w:val="18"/>
         </w:rPr>
-        <w:t>Supported team goals and daily operations by assisting with inventory shipments and maintaining floor visual standards.</w:t>
+        <w:t>Supported team goals and operational efficiency by processing freight shipments, ticketing merchandise, and executing seasonal floor resets.</w:t>
       </w:r>
     </w:p>
     <w:p>
       <w:pPr>
-        <w:spacing w:before="120" w:after="40"/>
+        <w:spacing w:before="60" w:after="20" w:line="276" w:lineRule="auto"/>
       </w:pPr>
       <w:r>
         <w:rPr>
           <w:rFonts w:ascii="Arial" w:hAnsi="Arial"/>
           <w:b/>
-          <w:color w:val="282828"/>
-          <w:sz w:val="21"/>
+          <w:sz w:val="19"/>
         </w:rPr>
-        <w:t>Team Member</w:t>
+        <w:t>Team Member  |  Tim Hortons</w:t>
       </w:r>
       <w:r>
         <w:rPr>
           <w:rFonts w:ascii="Arial" w:hAnsi="Arial"/>
           <w:i/>
-          <w:color w:val="464646"/>
-          <w:sz w:val="20"/>
+          <w:color w:val="1B4D3E"/>
+          <w:sz w:val="17"/>
         </w:rPr>
-        <w:t xml:space="preserve">  |  Tim Hortons  —  Hampton, NB</w:t>
-      </w:r>
-    </w:p>
-    <w:p>
-      <w:pPr>
-        <w:spacing w:after="80"/>
-      </w:pPr>
-      <w:r>
-        <w:rPr>
-          <w:b/>
-          <w:color w:val="1B4D3E"/>
-          <w:sz w:val="19"/>
-        </w:rPr>
-        <w:t>June 2023 – June 2025</w:t>
+        <w:t xml:space="preserve">   (June 2023 – June 2025 | Hampton, NB)</w:t>
       </w:r>
     </w:p>
     <w:p>
       <w:pPr>
         <w:pStyle w:val="ListBullet"/>
-        <w:spacing w:after="40" w:line="264" w:lineRule="auto"/>
+        <w:spacing w:before="0" w:after="30"/>
       </w:pPr>
       <w:r>
         <w:rPr>
           <w:rFonts w:ascii="Arial" w:hAnsi="Arial"/>
-          <w:color w:val="282828"/>
-          <w:sz w:val="19"/>
+          <w:sz w:val="18"/>
         </w:rPr>
-        <w:t>Delivered fast, friendly, and accurate service to customers in a high-volume, fast-paced environment.</w:t>
+        <w:t>Delivered fast, friendly, and accurate service to hundreds of customers daily in a high-volume, fast-paced environment.</w:t>
       </w:r>
     </w:p>
     <w:p>
       <w:pPr>
         <w:pStyle w:val="ListBullet"/>
-        <w:spacing w:after="40" w:line="264" w:lineRule="auto"/>
+        <w:spacing w:before="0" w:after="30"/>
       </w:pPr>
       <w:r>
         <w:rPr>
           <w:rFonts w:ascii="Arial" w:hAnsi="Arial"/>
-          <w:color w:val="282828"/>
-          <w:sz w:val="19"/>
+          <w:sz w:val="18"/>
         </w:rPr>
-        <w:t>Prepared and assembled food and beverage orders efficiently while strictly adhering to health, safety, and quality standards.</w:t>
+        <w:t>Managed POS drive-thru and front-counter transactions, securely handling payments and balancing cash drawers.</w:t>
       </w:r>
     </w:p>
     <w:p>
       <w:pPr>
         <w:pStyle w:val="ListBullet"/>
-        <w:spacing w:after="40" w:line="264" w:lineRule="auto"/>
+        <w:spacing w:before="0" w:after="30"/>
       </w:pPr>
       <w:r>
         <w:rPr>
           <w:rFonts w:ascii="Arial" w:hAnsi="Arial"/>
-          <w:color w:val="282828"/>
-          <w:sz w:val="19"/>
+          <w:sz w:val="18"/>
         </w:rPr>
-        <w:t>Managed point-of-sale (POS) transactions, securely handling cash and digital payments while maintaining accurate till balances.</w:t>
+        <w:t>Prepared food and specialty beverage orders efficiently while strictly adhering to food safety, hygiene, and quality standards.</w:t>
       </w:r>
     </w:p>
     <w:p>
       <w:pPr>
         <w:pStyle w:val="ListBullet"/>
-        <w:spacing w:after="40" w:line="264" w:lineRule="auto"/>
+        <w:spacing w:before="0" w:after="30"/>
       </w:pPr>
       <w:r>
         <w:rPr>
           <w:rFonts w:ascii="Arial" w:hAnsi="Arial"/>
-          <w:color w:val="282828"/>
-          <w:sz w:val="19"/>
+          <w:sz w:val="18"/>
         </w:rPr>
-        <w:t>Upheld strict cleanliness and sanitation standards across the drive-thru, counter, and food preparation areas.</w:t>
+        <w:t>Maintained strict cleanliness and station organization across front counter, drive-thru, and prep zones.</w:t>
       </w:r>
     </w:p>
     <w:p>
       <w:pPr>
-        <w:spacing w:before="200" w:after="80"/>
+        <w:keepNext/>
+        <w:spacing w:before="160" w:after="60"/>
         <w:pBdr>
           <w:bottom w:val="single" w:sz="8" w:space="2" w:color="1B4D3E"/>
         </w:pBdr>
@@ -434,58 +384,61 @@
           <w:rFonts w:ascii="Arial" w:hAnsi="Arial"/>
           <w:b/>
           <w:color w:val="1B4D3E"/>
-          <w:sz w:val="22"/>
+          <w:sz w:val="21"/>
         </w:rPr>
-        <w:t>EDUCATION</w:t>
+        <w:t>CERTIFICATIONS &amp; SAFETY TRAINING</w:t>
       </w:r>
     </w:p>
     <w:p>
       <w:pPr>
-        <w:spacing w:before="80" w:after="40"/>
+        <w:pStyle w:val="ListBullet"/>
+        <w:spacing w:before="0" w:after="30"/>
       </w:pPr>
       <w:r>
         <w:rPr>
           <w:rFonts w:ascii="Arial" w:hAnsi="Arial"/>
           <w:b/>
-          <w:color w:val="282828"/>
-          <w:sz w:val="20"/>
+          <w:sz w:val="18"/>
         </w:rPr>
-        <w:t>Practical Nursing Diploma (In Progress)</w:t>
+        <w:t xml:space="preserve">CPR / AED Level C Certification — Life Start Training Inc. </w:t>
       </w:r>
       <w:r>
         <w:rPr>
+          <w:rFonts w:ascii="Arial" w:hAnsi="Arial"/>
           <w:i/>
-          <w:color w:val="464646"/>
-          <w:sz w:val="19"/>
+          <w:color w:val="1B4D3E"/>
+          <w:sz w:val="17"/>
         </w:rPr>
-        <w:t xml:space="preserve">  |  New Brunswick Community College (NBCC) — Nursing Student 2026 – 2028</w:t>
+        <w:t>(Certified Valid through July 13, 2029)</w:t>
       </w:r>
     </w:p>
     <w:p>
       <w:pPr>
-        <w:spacing w:before="40" w:after="40"/>
+        <w:pStyle w:val="ListBullet"/>
+        <w:spacing w:before="0" w:after="30"/>
       </w:pPr>
       <w:r>
         <w:rPr>
           <w:rFonts w:ascii="Arial" w:hAnsi="Arial"/>
           <w:b/>
-          <w:color w:val="282828"/>
-          <w:sz w:val="20"/>
+          <w:sz w:val="18"/>
         </w:rPr>
-        <w:t>High School Diploma</w:t>
+        <w:t xml:space="preserve">WorkSafeNB JHSC eLearning Series — WorkSafeNB </w:t>
       </w:r>
       <w:r>
         <w:rPr>
+          <w:rFonts w:ascii="Arial" w:hAnsi="Arial"/>
           <w:i/>
-          <w:color w:val="464646"/>
-          <w:sz w:val="19"/>
+          <w:color w:val="1B4D3E"/>
+          <w:sz w:val="17"/>
         </w:rPr>
-        <w:t xml:space="preserve">  |  Kennebecasis Valley High School (KVHS), Quispamsis, NB</w:t>
+        <w:t>(Completed October 2026)</w:t>
       </w:r>
     </w:p>
     <w:p>
       <w:pPr>
-        <w:spacing w:before="200" w:after="80"/>
+        <w:keepNext/>
+        <w:spacing w:before="160" w:after="60"/>
         <w:pBdr>
           <w:bottom w:val="single" w:sz="8" w:space="2" w:color="1B4D3E"/>
         </w:pBdr>
@@ -495,28 +448,102 @@
           <w:rFonts w:ascii="Arial" w:hAnsi="Arial"/>
           <w:b/>
           <w:color w:val="1B4D3E"/>
-          <w:sz w:val="22"/>
+          <w:sz w:val="21"/>
+        </w:rPr>
+        <w:t>EDUCATION</w:t>
+      </w:r>
+    </w:p>
+    <w:p>
+      <w:pPr>
+        <w:spacing w:before="0" w:after="20" w:line="276" w:lineRule="auto"/>
+      </w:pPr>
+      <w:r>
+        <w:rPr>
+          <w:rFonts w:ascii="Arial" w:hAnsi="Arial"/>
+          <w:b/>
+          <w:sz w:val="19"/>
+        </w:rPr>
+        <w:t xml:space="preserve">Kennebecasis Valley High School (KVHS) — Quispamsis, NB   </w:t>
+      </w:r>
+      <w:r>
+        <w:rPr>
+          <w:rFonts w:ascii="Arial" w:hAnsi="Arial"/>
+          <w:i/>
+          <w:color w:val="555555"/>
+          <w:sz w:val="17"/>
+        </w:rPr>
+        <w:t>|   Graduated June 2025</w:t>
+      </w:r>
+    </w:p>
+    <w:p>
+      <w:pPr>
+        <w:spacing w:before="0" w:after="40" w:line="276" w:lineRule="auto"/>
+      </w:pPr>
+      <w:r>
+        <w:rPr>
+          <w:rFonts w:ascii="Arial" w:hAnsi="Arial"/>
+          <w:sz w:val="18"/>
+        </w:rPr>
+        <w:t>High School Diploma • Honors with strong coursework in Business Economics (94%), Law, and Communications.</w:t>
+      </w:r>
+    </w:p>
+    <w:p>
+      <w:pPr>
+        <w:spacing w:before="0" w:after="20" w:line="276" w:lineRule="auto"/>
+      </w:pPr>
+      <w:r>
+        <w:rPr>
+          <w:rFonts w:ascii="Arial" w:hAnsi="Arial"/>
+          <w:b/>
+          <w:sz w:val="19"/>
+        </w:rPr>
+        <w:t xml:space="preserve">New Brunswick Community College (NBCC)   </w:t>
+      </w:r>
+      <w:r>
+        <w:rPr>
+          <w:rFonts w:ascii="Arial" w:hAnsi="Arial"/>
+          <w:i/>
+          <w:color w:val="555555"/>
+          <w:sz w:val="17"/>
+        </w:rPr>
+        <w:t>|   Healthcare Studies (2026)</w:t>
+      </w:r>
+    </w:p>
+    <w:p>
+      <w:pPr>
+        <w:keepNext/>
+        <w:spacing w:before="160" w:after="60"/>
+        <w:pBdr>
+          <w:bottom w:val="single" w:sz="8" w:space="2" w:color="1B4D3E"/>
+        </w:pBdr>
+      </w:pPr>
+      <w:r>
+        <w:rPr>
+          <w:rFonts w:ascii="Arial" w:hAnsi="Arial"/>
+          <w:b/>
+          <w:color w:val="1B4D3E"/>
+          <w:sz w:val="21"/>
         </w:rPr>
         <w:t>REFERENCES</w:t>
       </w:r>
     </w:p>
     <w:p>
       <w:pPr>
-        <w:spacing w:before="80"/>
+        <w:spacing w:before="0" w:after="40" w:line="276" w:lineRule="auto"/>
       </w:pPr>
       <w:r>
         <w:rPr>
           <w:rFonts w:ascii="Arial" w:hAnsi="Arial"/>
           <w:i/>
-          <w:color w:val="464646"/>
-          <w:sz w:val="19"/>
+          <w:color w:val="646464"/>
+          <w:sz w:val="18"/>
         </w:rPr>
         <w:t>Available upon request</w:t>
       </w:r>
     </w:p>
     <w:sectPr>
       <w:pgSz w:w="12240" w:h="15840"/>
-      <w:pgMar w:top="720" w:right="936" w:bottom="720" w:left="936" w:header="720" w:footer="720" w:gutter="0"/>
+      <w:pgMar w:top="576" w:right="792" w:bottom="576" w:left="792" w:header="720" w:footer="720" w:gutter="0"/>
       <w:cols w:space="720"/>
       <w:docGrid w:linePitch="360"/>
     </w:sectPr>

</xml_diff>